<commit_message>
More colors, Goals Agent
</commit_message>
<xml_diff>
--- a/Allen_Hoem_Resume-gDrive-Github.docx
+++ b/Allen_Hoem_Resume-gDrive-Github.docx
@@ -132,13 +132,31 @@
           <w:szCs w:val="21"/>
           <w:rtl w:val="0"/>
         </w:rPr>
-        <w:t xml:space="preserve">High-impact Product </w:t>
-      </w:r>
-      <w:r>
-        <w:rPr>
-          <w:rtl w:val="0"/>
-        </w:rPr>
-        <w:t xml:space="preserve">Leader</w:t>
+        <w:t xml:space="preserve">High-impact </w:t>
+      </w:r>
+      <w:r>
+        <w:rPr>
+          <w:rtl w:val="0"/>
+        </w:rPr>
+        <w:t xml:space="preserve">p</w:t>
+      </w:r>
+      <w:r>
+        <w:rPr>
+          <w:b w:val="0"/>
+          <w:bCs w:val="0"/>
+          <w:i w:val="0"/>
+          <w:iCs w:val="0"/>
+          <w:sz w:val="21"/>
+          <w:szCs w:val="21"/>
+          <w:rtl w:val="0"/>
+        </w:rPr>
+        <w:t xml:space="preserve">roduct </w:t>
+      </w:r>
+      <w:r>
+        <w:rPr>
+          <w:rtl w:val="0"/>
+        </w:rPr>
+        <w:t xml:space="preserve">leader</w:t>
       </w:r>
       <w:r>
         <w:rPr>
@@ -192,7 +210,7 @@
         <w:rPr>
           <w:rtl w:val="0"/>
         </w:rPr>
-        <w:t xml:space="preserve">designing</w:t>
+        <w:t xml:space="preserve">developing</w:t>
       </w:r>
       <w:r>
         <w:rPr>
@@ -210,55 +228,19 @@
         <w:rPr>
           <w:rtl w:val="0"/>
         </w:rPr>
-        <w:t xml:space="preserve">entity, </w:t>
-      </w:r>
-      <w:r>
-        <w:rPr>
-          <w:b w:val="0"/>
-          <w:bCs w:val="0"/>
-          <w:i w:val="0"/>
-          <w:iCs w:val="0"/>
-          <w:sz w:val="21"/>
-          <w:szCs w:val="21"/>
-          <w:rtl w:val="0"/>
-        </w:rPr>
-        <w:t xml:space="preserve">RAG and vector-search context layers, </w:t>
-      </w:r>
-      <w:r>
-        <w:rPr>
-          <w:rtl w:val="0"/>
-        </w:rPr>
-        <w:t xml:space="preserve">measuring</w:t>
-      </w:r>
-      <w:r>
-        <w:rPr>
-          <w:b w:val="0"/>
-          <w:bCs w:val="0"/>
-          <w:i w:val="0"/>
-          <w:iCs w:val="0"/>
-          <w:sz w:val="21"/>
-          <w:szCs w:val="21"/>
-          <w:rtl w:val="0"/>
-        </w:rPr>
-        <w:t xml:space="preserve"> </w:t>
-      </w:r>
-      <w:r>
-        <w:rPr>
-          <w:rtl w:val="0"/>
-        </w:rPr>
-        <w:t xml:space="preserve">CTS</w:t>
-      </w:r>
-      <w:r>
-        <w:rPr>
-          <w:b w:val="0"/>
-          <w:bCs w:val="0"/>
-          <w:i w:val="0"/>
-          <w:iCs w:val="0"/>
-          <w:sz w:val="21"/>
-          <w:szCs w:val="21"/>
-          <w:rtl w:val="0"/>
-        </w:rPr>
-        <w:t xml:space="preserve"> to protect platform margins, and building auditable guardrails that make agentic AI defensible for regulated industries including pharmaceutical, financial services, and healthcare. Expert at translating deep technical architecture into multi-million-dollar commercial pipelines — driving $8M/mo in recurring platform revenue, 30% CAGR in high-scale messaging adoption, 300% CAGR in agentic feature adoption, and $6M/year in operational savings while securing the trust of Fortune 500 executives.</w:t>
+        <w:t xml:space="preserve">entity, marketing context retriever agents,</w:t>
+      </w:r>
+      <w:r>
+        <w:rPr>
+          <w:b w:val="0"/>
+          <w:bCs w:val="0"/>
+          <w:i w:val="0"/>
+          <w:iCs w:val="0"/>
+          <w:sz w:val="21"/>
+          <w:szCs w:val="21"/>
+          <w:rtl w:val="0"/>
+        </w:rPr>
+        <w:t xml:space="preserve"> vector-searchable context layers, and building guardrails that make agentic AI defensible for regulated industries including pharmaceutical, financial services, and healthcare. Expert at translating deep technical architecture into multi-million-dollar commercial pipelines — driving $8M/mo in recurring platform revenue, 30% CAGR in high-scale messaging adoption, 300% CAGR in agentic feature adoption, and $6M/year in operational savings while securing the trust of Fortune 500 executives.</w:t>
       </w:r>
       <w:r>
         <w:rPr>
@@ -603,7 +585,7 @@
           <w:szCs w:val="20"/>
           <w:rtl w:val="0"/>
         </w:rPr>
-        <w:t xml:space="preserve">Generative &amp; Predictive AI Strategy · Enterprise Autonomous Agent Architecture · Multi-Agent Interoperability (MCP · A2A · A2UI) · RAG, Vector Search &amp; Embeddings · Prompt &amp; Semantic Caching · Model Routing &amp; BYOM · Inference Cost Optimization · LLM Orchestration · AI Governance &amp; Guardrails</w:t>
+        <w:t xml:space="preserve">Generative &amp; Predictive AI Strategy · Enterprise Autonomous Agent Architecture · Multi-Agent Interoperability (MCP · A2A · A2UI  · SDLS2) · RAG, Vector Search &amp; Embeddings · Prompt &amp; Semantic Caching · Model Routing &amp; BYOM · Inference Cost Optimization · LLM Orchestration · AI Governance &amp; Guardrails</w:t>
       </w:r>
       <w:r>
         <w:rPr>
@@ -760,47 +742,28 @@
         </w:pBdr>
         <w:shd w:fill="auto" w:val="clear"/>
         <w:spacing w:after="0" w:before="0" w:line="250" w:lineRule="auto"/>
-        <w:ind w:left="317" w:right="0" w:hanging="230"/>
+        <w:ind w:left="1037" w:right="0" w:hanging="230"/>
         <w:jc w:val="left"/>
         <w:rPr/>
       </w:pPr>
       <w:r>
         <w:rPr>
-          <w:rFonts w:ascii="Calibri" w:cs="Calibri" w:eastAsia="Calibri" w:hAnsi="Calibri"/>
-          <w:b w:val="1"/>
-          <w:bCs w:val="1"/>
-          <w:i w:val="0"/>
-          <w:iCs w:val="0"/>
-          <w:smallCaps w:val="0"/>
-          <w:strike w:val="0"/>
-          <w:color w:val="222222"/>
-          <w:sz w:val="21"/>
-          <w:szCs w:val="21"/>
-          <w:u w:val="none"/>
-          <w:shd w:fill="auto" w:val="clear"/>
-          <w:vertAlign w:val="baseline"/>
-          <w:rtl w:val="0"/>
-        </w:rPr>
-        <w:t xml:space="preserve">Led mission-critical, AI-native platforms trusted by Fortune 500 enterprises </w:t>
-      </w:r>
-      <w:r>
-        <w:rPr>
-          <w:rFonts w:ascii="Calibri" w:cs="Calibri" w:eastAsia="Calibri" w:hAnsi="Calibri"/>
-          <w:b w:val="0"/>
-          <w:bCs w:val="0"/>
-          <w:i w:val="0"/>
-          <w:iCs w:val="0"/>
-          <w:smallCaps w:val="0"/>
-          <w:strike w:val="0"/>
-          <w:color w:val="222222"/>
-          <w:sz w:val="21"/>
-          <w:szCs w:val="21"/>
-          <w:u w:val="none"/>
-          <w:shd w:fill="auto" w:val="clear"/>
-          <w:vertAlign w:val="baseline"/>
-          <w:rtl w:val="0"/>
-        </w:rPr>
-        <w:t xml:space="preserve">— engineering the reliability, high-availability, and rapid adoption that drove 300% CAGR in agentic feature adoption across the portfolio and sustained $8M/mo in recurring platform revenue.</w:t>
+          <w:b w:val="1"/>
+          <w:bCs w:val="1"/>
+          <w:rtl w:val="0"/>
+        </w:rPr>
+        <w:t xml:space="preserve">Led agentic strategy and interaction patterns for Marketing Goals Agent </w:t>
+      </w:r>
+      <w:r>
+        <w:rPr>
+          <w:rtl w:val="0"/>
+        </w:rPr>
+        <w:t xml:space="preserve">through vibe-coded, high-fidelity concept testing, executive customer briefings, and rapid weekly check-points with executive leadership.  The Marketing Goals agent combines agentic marketing resource management, creative and strategy briefing, with customer knowledge grounding to autonomously plan, publish, and optimize marketing campaigns in real-time using generative content, multi-armed contextual bandits, and audience arbitration against campaign goals and KPIs.</w:t>
+      </w:r>
+      <w:r>
+        <w:rPr>
+          <w:rtl w:val="0"/>
+        </w:rPr>
       </w:r>
     </w:p>
     <w:p>
@@ -822,7 +785,7 @@
         </w:pBdr>
         <w:shd w:fill="auto" w:val="clear"/>
         <w:spacing w:after="0" w:before="0" w:line="250" w:lineRule="auto"/>
-        <w:ind w:left="317" w:right="0" w:hanging="230"/>
+        <w:ind w:left="1037" w:right="0" w:hanging="230"/>
         <w:jc w:val="left"/>
         <w:rPr/>
       </w:pPr>
@@ -906,7 +869,7 @@
         </w:pBdr>
         <w:shd w:fill="auto" w:val="clear"/>
         <w:spacing w:after="0" w:before="0" w:line="250" w:lineRule="auto"/>
-        <w:ind w:left="317" w:right="0" w:hanging="230"/>
+        <w:ind w:left="1037" w:right="0" w:hanging="230"/>
         <w:jc w:val="left"/>
         <w:rPr/>
       </w:pPr>
@@ -922,7 +885,7 @@
         <w:rPr>
           <w:rtl w:val="0"/>
         </w:rPr>
-        <w:t xml:space="preserve">by orchestrating product strategy and cross-cloud coordination across 5 core enterprise clouds (Data Cloud, Agentforce Platform, Marketing Cloud Next, Marketing Cloud AI, and Commerce Cloud) — scaling the Campaign Creation Agent from a 3-customer closed pilot to a 100+ customer beta to 500+ GA accounts —  aiding in the growth of 5,000+ (re)newed accounts within three years.</w:t>
+        <w:t xml:space="preserve">by orchestrating product strategy and cross-cloud coordination across 5 core enterprise clouds (Data Cloud, Agentforce Platform, Marketing Cloud Next, Marketing Cloud AI, and Commerce Cloud) — scaling the Campaign Creation Agent from a 3-customer closed pilot to a 100+ customer beta to 500+ GA accounts —  aiding in the growth of 5,000+ (re)newed Marketing Cloud Next accounts over three years.</w:t>
       </w:r>
       <w:r>
         <w:rPr>
@@ -949,7 +912,7 @@
         </w:pBdr>
         <w:shd w:fill="auto" w:val="clear"/>
         <w:spacing w:after="0" w:before="0" w:line="250" w:lineRule="auto"/>
-        <w:ind w:left="317" w:right="0" w:hanging="230"/>
+        <w:ind w:left="1037" w:right="0" w:hanging="230"/>
         <w:jc w:val="left"/>
         <w:rPr/>
       </w:pPr>
@@ -959,7 +922,7 @@
           <w:bCs w:val="1"/>
           <w:rtl w:val="0"/>
         </w:rPr>
-        <w:t xml:space="preserve">Designed</w:t>
+        <w:t xml:space="preserve">Defined</w:t>
       </w:r>
       <w:r>
         <w:rPr>
@@ -1044,7 +1007,7 @@
         </w:pBdr>
         <w:shd w:fill="auto" w:val="clear"/>
         <w:spacing w:after="0" w:before="0" w:line="250" w:lineRule="auto"/>
-        <w:ind w:left="317" w:right="0" w:hanging="230"/>
+        <w:ind w:left="1037" w:right="0" w:hanging="230"/>
         <w:jc w:val="left"/>
         <w:rPr/>
       </w:pPr>
@@ -1109,7 +1072,7 @@
           <w:vertAlign w:val="baseline"/>
           <w:rtl w:val="0"/>
         </w:rPr>
-        <w:t xml:space="preserve"> Azure GPT) and a governed Bring-Your-Own-Model (BYOM) extensibility framework; cut per-query token cost through a “Markdown-as-Metadata” semantic layer, Delta-Vectoring to avoid redundant re-embedding, and pre-computed vectorized performance summaries that eliminated repeat LLM calls.</w:t>
+        <w:t xml:space="preserve"> Azure GPT) and a governed Bring-Your-Own-Model (BYOM) extensibility framework; cut per-query cost through a “Markdown-as-Metadata” semantic layer, and pre-computed vectorized performance summaries that eliminated repeat LLM calls.</w:t>
       </w:r>
     </w:p>
     <w:p>
@@ -1131,7 +1094,7 @@
         </w:pBdr>
         <w:shd w:fill="auto" w:val="clear"/>
         <w:spacing w:after="0" w:before="0" w:line="250" w:lineRule="auto"/>
-        <w:ind w:left="317" w:right="0" w:hanging="230"/>
+        <w:ind w:left="1037" w:right="0" w:hanging="230"/>
         <w:jc w:val="left"/>
         <w:rPr/>
       </w:pPr>
@@ -1342,7 +1305,7 @@
         </w:pBdr>
         <w:shd w:fill="auto" w:val="clear"/>
         <w:spacing w:after="0" w:before="0" w:line="250" w:lineRule="auto"/>
-        <w:ind w:left="317" w:right="0" w:hanging="230"/>
+        <w:ind w:left="1037" w:right="0" w:hanging="230"/>
         <w:jc w:val="left"/>
         <w:rPr/>
       </w:pPr>
@@ -1404,7 +1367,7 @@
         </w:pBdr>
         <w:shd w:fill="auto" w:val="clear"/>
         <w:spacing w:after="0" w:before="0" w:line="250" w:lineRule="auto"/>
-        <w:ind w:left="317" w:right="0" w:hanging="230"/>
+        <w:ind w:left="1037" w:right="0" w:hanging="230"/>
         <w:jc w:val="left"/>
         <w:rPr/>
       </w:pPr>
@@ -1444,7 +1407,32 @@
           <w:vertAlign w:val="baseline"/>
           <w:rtl w:val="0"/>
         </w:rPr>
-        <w:t xml:space="preserve">— built the field consumption-estimation framework (per-agent action modeling and Flex Credit draw-down) and led the October 2025 migration off legacy Einstein Request entitlements to Flex Credits across Growth/Advanced, Engagement+, and Marketing Intelligence — extending the unified Einstein1 SKU strategy with plan-of-record approval from product leadership and the Office of the COO.</w:t>
+        <w:t xml:space="preserve">— built </w:t>
+      </w:r>
+      <w:r>
+        <w:rPr>
+          <w:rtl w:val="0"/>
+        </w:rPr>
+        <w:t xml:space="preserve">a </w:t>
+      </w:r>
+      <w:r>
+        <w:rPr>
+          <w:rFonts w:ascii="Calibri" w:cs="Calibri" w:eastAsia="Calibri" w:hAnsi="Calibri"/>
+          <w:b w:val="0"/>
+          <w:bCs w:val="0"/>
+          <w:i w:val="0"/>
+          <w:iCs w:val="0"/>
+          <w:smallCaps w:val="0"/>
+          <w:strike w:val="0"/>
+          <w:color w:val="222222"/>
+          <w:sz w:val="21"/>
+          <w:szCs w:val="21"/>
+          <w:u w:val="none"/>
+          <w:shd w:fill="auto" w:val="clear"/>
+          <w:vertAlign w:val="baseline"/>
+          <w:rtl w:val="0"/>
+        </w:rPr>
+        <w:t xml:space="preserve">consumption-estimation framework (per-agent action modeling and Flex Credit draw-down) and led the October 2025 migration off legacy Einstein Request entitlements to Flex Credits across Growth/Advanced, Engagement+, and Marketing Intelligence — extending the unified Einstein1 SKU strategy with plan-of-record approval from product leadership and the Office of the COO.</w:t>
       </w:r>
     </w:p>
     <w:p>
@@ -1466,7 +1454,7 @@
         </w:pBdr>
         <w:shd w:fill="auto" w:val="clear"/>
         <w:spacing w:after="0" w:before="0" w:line="250" w:lineRule="auto"/>
-        <w:ind w:left="317" w:right="0" w:hanging="230"/>
+        <w:ind w:left="1037" w:right="0" w:hanging="230"/>
         <w:jc w:val="left"/>
         <w:rPr/>
       </w:pPr>
@@ -1528,7 +1516,7 @@
         </w:pBdr>
         <w:shd w:fill="auto" w:val="clear"/>
         <w:spacing w:after="0" w:before="0" w:line="250" w:lineRule="auto"/>
-        <w:ind w:left="317" w:right="0" w:hanging="230"/>
+        <w:ind w:left="1037" w:right="0" w:hanging="230"/>
         <w:jc w:val="left"/>
         <w:rPr/>
       </w:pPr>
@@ -1590,28 +1578,36 @@
         </w:pBdr>
         <w:shd w:fill="auto" w:val="clear"/>
         <w:spacing w:after="0" w:before="0" w:line="250" w:lineRule="auto"/>
-        <w:ind w:left="317" w:right="0" w:hanging="230"/>
+        <w:ind w:left="1037" w:right="0" w:hanging="230"/>
         <w:jc w:val="left"/>
         <w:rPr/>
       </w:pPr>
       <w:r>
         <w:rPr>
-          <w:rFonts w:ascii="Calibri" w:cs="Calibri" w:eastAsia="Calibri" w:hAnsi="Calibri"/>
-          <w:b w:val="1"/>
-          <w:bCs w:val="1"/>
-          <w:i w:val="0"/>
-          <w:iCs w:val="0"/>
-          <w:smallCaps w:val="0"/>
-          <w:strike w:val="0"/>
-          <w:color w:val="222222"/>
-          <w:sz w:val="21"/>
-          <w:szCs w:val="21"/>
-          <w:u w:val="none"/>
-          <w:shd w:fill="auto" w:val="clear"/>
-          <w:vertAlign w:val="baseline"/>
-          <w:rtl w:val="0"/>
-        </w:rPr>
-        <w:t xml:space="preserve">Directed growth for Salesforce’s highest-volume engagement channel </w:t>
+          <w:b w:val="1"/>
+          <w:bCs w:val="1"/>
+          <w:rtl w:val="0"/>
+        </w:rPr>
+        <w:t xml:space="preserve">Delivered</w:t>
+      </w:r>
+      <w:r>
+        <w:rPr>
+          <w:rFonts w:ascii="Calibri" w:cs="Calibri" w:eastAsia="Calibri" w:hAnsi="Calibri"/>
+          <w:b w:val="1"/>
+          <w:bCs w:val="1"/>
+          <w:i w:val="0"/>
+          <w:iCs w:val="0"/>
+          <w:smallCaps w:val="0"/>
+          <w:strike w:val="0"/>
+          <w:color w:val="222222"/>
+          <w:sz w:val="21"/>
+          <w:szCs w:val="21"/>
+          <w:u w:val="none"/>
+          <w:shd w:fill="auto" w:val="clear"/>
+          <w:vertAlign w:val="baseline"/>
+          <w:rtl w:val="0"/>
+        </w:rPr>
+        <w:t xml:space="preserve"> growth for Salesforce’s highest-volume engagement channel </w:t>
       </w:r>
       <w:r>
         <w:rPr>
@@ -1652,7 +1648,7 @@
         </w:pBdr>
         <w:shd w:fill="auto" w:val="clear"/>
         <w:spacing w:after="0" w:before="0" w:line="250" w:lineRule="auto"/>
-        <w:ind w:left="317" w:right="0" w:hanging="230"/>
+        <w:ind w:left="1037" w:right="0" w:hanging="230"/>
         <w:jc w:val="left"/>
         <w:rPr/>
       </w:pPr>
@@ -1673,51 +1669,210 @@
           <w:vertAlign w:val="baseline"/>
           <w:rtl w:val="0"/>
         </w:rPr>
-        <w:t xml:space="preserve">Captured competitive market share and defended marquee accounts </w:t>
-      </w:r>
-      <w:r>
-        <w:rPr>
-          <w:rFonts w:ascii="Calibri" w:cs="Calibri" w:eastAsia="Calibri" w:hAnsi="Calibri"/>
-          <w:b w:val="0"/>
-          <w:bCs w:val="0"/>
-          <w:i w:val="0"/>
-          <w:iCs w:val="0"/>
-          <w:smallCaps w:val="0"/>
-          <w:strike w:val="0"/>
-          <w:color w:val="222222"/>
-          <w:sz w:val="21"/>
-          <w:szCs w:val="21"/>
-          <w:u w:val="none"/>
-          <w:shd w:fill="auto" w:val="clear"/>
-          <w:vertAlign w:val="baseline"/>
-          <w:rtl w:val="0"/>
-        </w:rPr>
-        <w:t xml:space="preserve">(including Delta Airlines, Best Buy, and Charles Schwab) by </w:t>
-      </w:r>
-      <w:r>
-        <w:rPr>
-          <w:rtl w:val="0"/>
-        </w:rPr>
-        <w:t xml:space="preserve">guiding enterprise customers to</w:t>
-      </w:r>
-      <w:r>
-        <w:rPr>
-          <w:rFonts w:ascii="Calibri" w:cs="Calibri" w:eastAsia="Calibri" w:hAnsi="Calibri"/>
-          <w:b w:val="0"/>
-          <w:bCs w:val="0"/>
-          <w:i w:val="0"/>
-          <w:iCs w:val="0"/>
-          <w:smallCaps w:val="0"/>
-          <w:strike w:val="0"/>
-          <w:color w:val="222222"/>
-          <w:sz w:val="21"/>
-          <w:szCs w:val="21"/>
-          <w:u w:val="none"/>
-          <w:shd w:fill="auto" w:val="clear"/>
-          <w:vertAlign w:val="baseline"/>
-          <w:rtl w:val="0"/>
-        </w:rPr>
-        <w:t xml:space="preserve"> an Active-Active Transactional High-Availability framework and a modern transactional model that decentralized content control from client IT pipelines directly to enterprise marketers.</w:t>
+        <w:t xml:space="preserve">Eliminated systemic operational friction — $6M/year in savings — </w:t>
+      </w:r>
+      <w:r>
+        <w:rPr>
+          <w:rFonts w:ascii="Calibri" w:cs="Calibri" w:eastAsia="Calibri" w:hAnsi="Calibri"/>
+          <w:b w:val="0"/>
+          <w:bCs w:val="0"/>
+          <w:i w:val="0"/>
+          <w:iCs w:val="0"/>
+          <w:smallCaps w:val="0"/>
+          <w:strike w:val="0"/>
+          <w:color w:val="222222"/>
+          <w:sz w:val="21"/>
+          <w:szCs w:val="21"/>
+          <w:u w:val="none"/>
+          <w:shd w:fill="auto" w:val="clear"/>
+          <w:vertAlign w:val="baseline"/>
+          <w:rtl w:val="0"/>
+        </w:rPr>
+        <w:t xml:space="preserve">by mobilizing a cross-functional “tiger team” via Alert Manager that halted the costly reverse-escalation loop between Customer Success and Runtime Engineering.</w:t>
+      </w:r>
+    </w:p>
+    <w:p>
+      <w:pPr>
+        <w:tabs>
+          <w:tab w:val="right" w:leader="none" w:pos="10080"/>
+        </w:tabs>
+        <w:spacing w:after="40" w:before="20" w:lineRule="auto"/>
+        <w:rPr/>
+      </w:pPr>
+      <w:r>
+        <w:rPr>
+          <w:b w:val="1"/>
+          <w:bCs w:val="1"/>
+          <w:i w:val="1"/>
+          <w:iCs w:val="1"/>
+          <w:color w:val="1d4ed8"/>
+          <w:sz w:val="21"/>
+          <w:szCs w:val="21"/>
+          <w:rtl w:val="0"/>
+        </w:rPr>
+        <w:t xml:space="preserve">Senior Product Manager — Real-Time Messaging Platform</w:t>
+      </w:r>
+      <w:r>
+        <w:rPr>
+          <w:color w:val="555555"/>
+          <w:sz w:val="19"/>
+          <w:szCs w:val="19"/>
+          <w:rtl w:val="0"/>
+        </w:rPr>
+        <w:tab/>
+        <w:t xml:space="preserve">November 2016 – August 2019</w:t>
+      </w:r>
+      <w:r>
+        <w:rPr>
+          <w:rtl w:val="0"/>
+        </w:rPr>
+      </w:r>
+    </w:p>
+    <w:p>
+      <w:pPr>
+        <w:keepNext w:val="0"/>
+        <w:keepLines w:val="0"/>
+        <w:pageBreakBefore w:val="0"/>
+        <w:widowControl w:val="1"/>
+        <w:numPr>
+          <w:ilvl w:val="0"/>
+          <w:numId w:val="1"/>
+        </w:numPr>
+        <w:pBdr>
+          <w:top w:space="0" w:sz="0" w:val="nil"/>
+          <w:left w:space="0" w:sz="0" w:val="nil"/>
+          <w:bottom w:space="0" w:sz="0" w:val="nil"/>
+          <w:right w:space="0" w:sz="0" w:val="nil"/>
+          <w:between w:space="0" w:sz="0" w:val="nil"/>
+        </w:pBdr>
+        <w:shd w:fill="auto" w:val="clear"/>
+        <w:spacing w:after="0" w:before="0" w:line="250" w:lineRule="auto"/>
+        <w:ind w:left="1037" w:right="0" w:hanging="230"/>
+        <w:jc w:val="left"/>
+        <w:rPr/>
+      </w:pPr>
+      <w:r>
+        <w:rPr>
+          <w:rFonts w:ascii="Calibri" w:cs="Calibri" w:eastAsia="Calibri" w:hAnsi="Calibri"/>
+          <w:b w:val="1"/>
+          <w:bCs w:val="1"/>
+          <w:i w:val="0"/>
+          <w:iCs w:val="0"/>
+          <w:smallCaps w:val="0"/>
+          <w:strike w:val="0"/>
+          <w:color w:val="222222"/>
+          <w:sz w:val="21"/>
+          <w:szCs w:val="21"/>
+          <w:u w:val="none"/>
+          <w:shd w:fill="auto" w:val="clear"/>
+          <w:vertAlign w:val="baseline"/>
+          <w:rtl w:val="0"/>
+        </w:rPr>
+        <w:t xml:space="preserve">Shipped the real-time messaging platform that scaled to 7B+ messages/month </w:t>
+      </w:r>
+      <w:r>
+        <w:rPr>
+          <w:rFonts w:ascii="Calibri" w:cs="Calibri" w:eastAsia="Calibri" w:hAnsi="Calibri"/>
+          <w:b w:val="0"/>
+          <w:bCs w:val="0"/>
+          <w:i w:val="0"/>
+          <w:iCs w:val="0"/>
+          <w:smallCaps w:val="0"/>
+          <w:strike w:val="0"/>
+          <w:color w:val="222222"/>
+          <w:sz w:val="21"/>
+          <w:szCs w:val="21"/>
+          <w:u w:val="none"/>
+          <w:shd w:fill="auto" w:val="clear"/>
+          <w:vertAlign w:val="baseline"/>
+          <w:rtl w:val="0"/>
+        </w:rPr>
+        <w:t xml:space="preserve">(~$8M/mo in recurring revenue) at 30% CAGR adoption across 3,000+ customers — earning the 2019 Salesforce Innovation Award for its low-latency, high-availability architecture and viral enterprise adoption across global retailers, financial institutions, and airlines.</w:t>
+      </w:r>
+    </w:p>
+    <w:p>
+      <w:pPr>
+        <w:numPr>
+          <w:ilvl w:val="0"/>
+          <w:numId w:val="1"/>
+        </w:numPr>
+        <w:ind w:left="1080" w:hanging="360"/>
+      </w:pPr>
+      <w:r>
+        <w:rPr>
+          <w:b w:val="1"/>
+          <w:bCs w:val="1"/>
+          <w:rtl w:val="0"/>
+        </w:rPr>
+        <w:t xml:space="preserve">Captured competitive market share and defended marquee accounts</w:t>
+      </w:r>
+      <w:r>
+        <w:rPr>
+          <w:rtl w:val="0"/>
+        </w:rPr>
+        <w:t xml:space="preserve"> by guiding enterprise customers with the modern transactional Email and SMS platform that decentralized content control from client IT pipelines directly to enterprise marketers, offering vastly superior low-latency delivery, easy REST-like APIs, and real-time status webhooks. </w:t>
+      </w:r>
+    </w:p>
+    <w:p>
+      <w:pPr>
+        <w:keepNext w:val="0"/>
+        <w:keepLines w:val="0"/>
+        <w:pageBreakBefore w:val="0"/>
+        <w:widowControl w:val="1"/>
+        <w:numPr>
+          <w:ilvl w:val="0"/>
+          <w:numId w:val="1"/>
+        </w:numPr>
+        <w:pBdr>
+          <w:top w:space="0" w:sz="0" w:val="nil"/>
+          <w:left w:space="0" w:sz="0" w:val="nil"/>
+          <w:bottom w:space="0" w:sz="0" w:val="nil"/>
+          <w:right w:space="0" w:sz="0" w:val="nil"/>
+          <w:between w:space="0" w:sz="0" w:val="nil"/>
+        </w:pBdr>
+        <w:shd w:fill="auto" w:val="clear"/>
+        <w:spacing w:after="0" w:before="0" w:line="250" w:lineRule="auto"/>
+        <w:ind w:left="1037" w:right="0" w:hanging="230"/>
+        <w:jc w:val="left"/>
+        <w:rPr/>
+      </w:pPr>
+      <w:r>
+        <w:rPr>
+          <w:rFonts w:ascii="Calibri" w:cs="Calibri" w:eastAsia="Calibri" w:hAnsi="Calibri"/>
+          <w:b w:val="1"/>
+          <w:bCs w:val="1"/>
+          <w:i w:val="0"/>
+          <w:iCs w:val="0"/>
+          <w:smallCaps w:val="0"/>
+          <w:strike w:val="0"/>
+          <w:color w:val="222222"/>
+          <w:sz w:val="21"/>
+          <w:szCs w:val="21"/>
+          <w:u w:val="none"/>
+          <w:shd w:fill="auto" w:val="clear"/>
+          <w:vertAlign w:val="baseline"/>
+          <w:rtl w:val="0"/>
+        </w:rPr>
+        <w:t xml:space="preserve">Scaled core platform utilization </w:t>
+      </w:r>
+      <w:r>
+        <w:rPr>
+          <w:rFonts w:ascii="Calibri" w:cs="Calibri" w:eastAsia="Calibri" w:hAnsi="Calibri"/>
+          <w:b w:val="0"/>
+          <w:bCs w:val="0"/>
+          <w:i w:val="0"/>
+          <w:iCs w:val="0"/>
+          <w:smallCaps w:val="0"/>
+          <w:strike w:val="0"/>
+          <w:color w:val="222222"/>
+          <w:sz w:val="21"/>
+          <w:szCs w:val="21"/>
+          <w:u w:val="none"/>
+          <w:shd w:fill="auto" w:val="clear"/>
+          <w:vertAlign w:val="baseline"/>
+          <w:rtl w:val="0"/>
+        </w:rPr>
+        <w:t xml:space="preserve">by migrating Salesforce Pardot onto the real-time engine (onboarding 8,000+ enterprise customers) and powering mission-critical use cases including Salesforce MFA and Vaccine Cloud.</w:t>
       </w:r>
     </w:p>
     <w:p>
@@ -1739,7 +1894,7 @@
         </w:pBdr>
         <w:shd w:fill="auto" w:val="clear"/>
         <w:spacing w:after="40" w:before="0" w:line="250" w:lineRule="auto"/>
-        <w:ind w:left="317" w:right="0" w:hanging="230"/>
+        <w:ind w:left="1037" w:right="0" w:hanging="230"/>
         <w:jc w:val="left"/>
         <w:rPr/>
       </w:pPr>
@@ -1760,26 +1915,26 @@
           <w:vertAlign w:val="baseline"/>
           <w:rtl w:val="0"/>
         </w:rPr>
-        <w:t xml:space="preserve">Eliminated systemic operational friction — $6M/year in savings — </w:t>
-      </w:r>
-      <w:r>
-        <w:rPr>
-          <w:rFonts w:ascii="Calibri" w:cs="Calibri" w:eastAsia="Calibri" w:hAnsi="Calibri"/>
-          <w:b w:val="0"/>
-          <w:bCs w:val="0"/>
-          <w:i w:val="0"/>
-          <w:iCs w:val="0"/>
-          <w:smallCaps w:val="0"/>
-          <w:strike w:val="0"/>
-          <w:color w:val="222222"/>
-          <w:sz w:val="21"/>
-          <w:szCs w:val="21"/>
-          <w:u w:val="none"/>
-          <w:shd w:fill="auto" w:val="clear"/>
-          <w:vertAlign w:val="baseline"/>
-          <w:rtl w:val="0"/>
-        </w:rPr>
-        <w:t xml:space="preserve">by mobilizing a cross-functional “tiger team” via Alert Manager that halted the costly reverse-escalation loop between Customer Success and Runtime Engineering.</w:t>
+        <w:t xml:space="preserve">Standardized developer ecosystems </w:t>
+      </w:r>
+      <w:r>
+        <w:rPr>
+          <w:rFonts w:ascii="Calibri" w:cs="Calibri" w:eastAsia="Calibri" w:hAnsi="Calibri"/>
+          <w:b w:val="0"/>
+          <w:bCs w:val="0"/>
+          <w:i w:val="0"/>
+          <w:iCs w:val="0"/>
+          <w:smallCaps w:val="0"/>
+          <w:strike w:val="0"/>
+          <w:color w:val="222222"/>
+          <w:sz w:val="21"/>
+          <w:szCs w:val="21"/>
+          <w:u w:val="none"/>
+          <w:shd w:fill="auto" w:val="clear"/>
+          <w:vertAlign w:val="baseline"/>
+          <w:rtl w:val="0"/>
+        </w:rPr>
+        <w:t xml:space="preserve">by designing a developer-centric messaging API using Swagger/OpenAPI, accelerating alignment across engineering, documentation, and sales-demonstration teams.</w:t>
       </w:r>
     </w:p>
     <w:p>
@@ -1787,6 +1942,40 @@
         <w:tabs>
           <w:tab w:val="right" w:leader="none" w:pos="10080"/>
         </w:tabs>
+        <w:spacing w:before="140" w:lineRule="auto"/>
+        <w:rPr/>
+      </w:pPr>
+      <w:r>
+        <w:rPr>
+          <w:b w:val="1"/>
+          <w:bCs w:val="1"/>
+          <w:color w:val="0f1e3d"/>
+          <w:sz w:val="23"/>
+          <w:szCs w:val="23"/>
+          <w:rtl w:val="0"/>
+        </w:rPr>
+        <w:t xml:space="preserve">TERADATA</w:t>
+      </w:r>
+      <w:r>
+        <w:rPr>
+          <w:i w:val="1"/>
+          <w:iCs w:val="1"/>
+          <w:color w:val="555555"/>
+          <w:sz w:val="20"/>
+          <w:szCs w:val="20"/>
+          <w:rtl w:val="0"/>
+        </w:rPr>
+        <w:tab/>
+        <w:t xml:space="preserve">October 2014 – November 2016</w:t>
+      </w:r>
+      <w:r>
+        <w:rPr>
+          <w:rtl w:val="0"/>
+        </w:rPr>
+      </w:r>
+    </w:p>
+    <w:p>
+      <w:pPr>
         <w:spacing w:after="40" w:before="20" w:lineRule="auto"/>
         <w:rPr/>
       </w:pPr>
@@ -1801,17 +1990,7 @@
           <w:szCs w:val="21"/>
           <w:rtl w:val="0"/>
         </w:rPr>
-        <w:t xml:space="preserve">Senior Product Manager — Real-Time Messaging Platform</w:t>
-      </w:r>
-      <w:r>
-        <w:rPr>
-          <w:color w:val="555555"/>
-          <w:sz w:val="19"/>
-          <w:szCs w:val="19"/>
-          <w:rtl w:val="0"/>
-        </w:rPr>
-        <w:tab/>
-        <w:t xml:space="preserve">November 2016 – August 2019</w:t>
+        <w:t xml:space="preserve">Product Manager &amp; Scrum Product Owner — Intellisphere Data Ingestion</w:t>
       </w:r>
       <w:r>
         <w:rPr>
@@ -1838,7 +2017,7 @@
         </w:pBdr>
         <w:shd w:fill="auto" w:val="clear"/>
         <w:spacing w:after="0" w:before="0" w:line="250" w:lineRule="auto"/>
-        <w:ind w:left="317" w:right="0" w:hanging="230"/>
+        <w:ind w:left="1037" w:right="0" w:hanging="230"/>
         <w:jc w:val="left"/>
         <w:rPr/>
       </w:pPr>
@@ -1859,26 +2038,277 @@
           <w:vertAlign w:val="baseline"/>
           <w:rtl w:val="0"/>
         </w:rPr>
-        <w:t xml:space="preserve">Shipped the real-time messaging platform that scaled to 7B+ messages/month </w:t>
-      </w:r>
-      <w:r>
-        <w:rPr>
-          <w:rFonts w:ascii="Calibri" w:cs="Calibri" w:eastAsia="Calibri" w:hAnsi="Calibri"/>
-          <w:b w:val="0"/>
-          <w:bCs w:val="0"/>
-          <w:i w:val="0"/>
-          <w:iCs w:val="0"/>
-          <w:smallCaps w:val="0"/>
-          <w:strike w:val="0"/>
-          <w:color w:val="222222"/>
-          <w:sz w:val="21"/>
-          <w:szCs w:val="21"/>
-          <w:u w:val="none"/>
-          <w:shd w:fill="auto" w:val="clear"/>
-          <w:vertAlign w:val="baseline"/>
-          <w:rtl w:val="0"/>
-        </w:rPr>
-        <w:t xml:space="preserve">(~$8M/mo in recurring revenue) at 30% CAGR adoption across 3,000+ customers — earning the 2019 Salesforce Innovation Award for its low-latency, high-availability architecture and viral enterprise adoption across global retailers, financial institutions, and airlines.</w:t>
+        <w:t xml:space="preserve">Commercialized enterprise big-data orchestration software </w:t>
+      </w:r>
+      <w:r>
+        <w:rPr>
+          <w:rFonts w:ascii="Calibri" w:cs="Calibri" w:eastAsia="Calibri" w:hAnsi="Calibri"/>
+          <w:b w:val="0"/>
+          <w:bCs w:val="0"/>
+          <w:i w:val="0"/>
+          <w:iCs w:val="0"/>
+          <w:smallCaps w:val="0"/>
+          <w:strike w:val="0"/>
+          <w:color w:val="222222"/>
+          <w:sz w:val="21"/>
+          <w:szCs w:val="21"/>
+          <w:u w:val="none"/>
+          <w:shd w:fill="auto" w:val="clear"/>
+          <w:vertAlign w:val="baseline"/>
+          <w:rtl w:val="0"/>
+        </w:rPr>
+        <w:t xml:space="preserve">as end-to-end vision and GTM owner for Teradata Listener, building an elastic, cloud-native microservices architecture for real-time ingestion.</w:t>
+      </w:r>
+    </w:p>
+    <w:p>
+      <w:pPr>
+        <w:keepNext w:val="0"/>
+        <w:keepLines w:val="0"/>
+        <w:pageBreakBefore w:val="0"/>
+        <w:widowControl w:val="1"/>
+        <w:numPr>
+          <w:ilvl w:val="0"/>
+          <w:numId w:val="1"/>
+        </w:numPr>
+        <w:pBdr>
+          <w:top w:space="0" w:sz="0" w:val="nil"/>
+          <w:left w:space="0" w:sz="0" w:val="nil"/>
+          <w:bottom w:space="0" w:sz="0" w:val="nil"/>
+          <w:right w:space="0" w:sz="0" w:val="nil"/>
+          <w:between w:space="0" w:sz="0" w:val="nil"/>
+        </w:pBdr>
+        <w:shd w:fill="auto" w:val="clear"/>
+        <w:spacing w:after="40" w:before="0" w:line="250" w:lineRule="auto"/>
+        <w:ind w:left="1037" w:right="0" w:hanging="230"/>
+        <w:jc w:val="left"/>
+        <w:rPr/>
+      </w:pPr>
+      <w:r>
+        <w:rPr>
+          <w:rFonts w:ascii="Calibri" w:cs="Calibri" w:eastAsia="Calibri" w:hAnsi="Calibri"/>
+          <w:b w:val="1"/>
+          <w:bCs w:val="1"/>
+          <w:i w:val="0"/>
+          <w:iCs w:val="0"/>
+          <w:smallCaps w:val="0"/>
+          <w:strike w:val="0"/>
+          <w:color w:val="222222"/>
+          <w:sz w:val="21"/>
+          <w:szCs w:val="21"/>
+          <w:u w:val="none"/>
+          <w:shd w:fill="auto" w:val="clear"/>
+          <w:vertAlign w:val="baseline"/>
+          <w:rtl w:val="0"/>
+        </w:rPr>
+        <w:t xml:space="preserve">Slashed big-data connection latency to under 5 minutes </w:t>
+      </w:r>
+      <w:r>
+        <w:rPr>
+          <w:rFonts w:ascii="Calibri" w:cs="Calibri" w:eastAsia="Calibri" w:hAnsi="Calibri"/>
+          <w:b w:val="0"/>
+          <w:bCs w:val="0"/>
+          <w:i w:val="0"/>
+          <w:iCs w:val="0"/>
+          <w:smallCaps w:val="0"/>
+          <w:strike w:val="0"/>
+          <w:color w:val="222222"/>
+          <w:sz w:val="21"/>
+          <w:szCs w:val="21"/>
+          <w:u w:val="none"/>
+          <w:shd w:fill="auto" w:val="clear"/>
+          <w:vertAlign w:val="baseline"/>
+          <w:rtl w:val="0"/>
+        </w:rPr>
+        <w:t xml:space="preserve">by abstracting complex open-source streaming frameworks (Kafka, Confluent, ElasticDB, Kubernetes) into accessible Java/Go REST services and unified user interfaces.</w:t>
+      </w:r>
+      <w:r>
+        <w:rPr>
+          <w:rtl w:val="0"/>
+        </w:rPr>
+      </w:r>
+    </w:p>
+    <w:p>
+      <w:pPr>
+        <w:tabs>
+          <w:tab w:val="right" w:leader="none" w:pos="10080"/>
+        </w:tabs>
+        <w:spacing w:before="140" w:lineRule="auto"/>
+        <w:rPr/>
+      </w:pPr>
+      <w:r>
+        <w:rPr>
+          <w:b w:val="1"/>
+          <w:bCs w:val="1"/>
+          <w:color w:val="0f1e3d"/>
+          <w:sz w:val="23"/>
+          <w:szCs w:val="23"/>
+          <w:rtl w:val="0"/>
+        </w:rPr>
+        <w:t xml:space="preserve">ROKU</w:t>
+      </w:r>
+      <w:r>
+        <w:rPr>
+          <w:i w:val="1"/>
+          <w:iCs w:val="1"/>
+          <w:color w:val="555555"/>
+          <w:sz w:val="20"/>
+          <w:szCs w:val="20"/>
+          <w:rtl w:val="0"/>
+        </w:rPr>
+        <w:tab/>
+        <w:t xml:space="preserve">January 2014 – October 2014</w:t>
+      </w:r>
+      <w:r>
+        <w:rPr>
+          <w:rtl w:val="0"/>
+        </w:rPr>
+      </w:r>
+    </w:p>
+    <w:p>
+      <w:pPr>
+        <w:spacing w:after="40" w:before="20" w:lineRule="auto"/>
+        <w:rPr/>
+      </w:pPr>
+      <w:r>
+        <w:rPr>
+          <w:b w:val="1"/>
+          <w:bCs w:val="1"/>
+          <w:i w:val="1"/>
+          <w:iCs w:val="1"/>
+          <w:color w:val="1d4ed8"/>
+          <w:sz w:val="21"/>
+          <w:szCs w:val="21"/>
+          <w:rtl w:val="0"/>
+        </w:rPr>
+        <w:t xml:space="preserve">Product Software Partner Manager</w:t>
+      </w:r>
+      <w:r>
+        <w:rPr>
+          <w:rtl w:val="0"/>
+        </w:rPr>
+      </w:r>
+    </w:p>
+    <w:p>
+      <w:pPr>
+        <w:keepNext w:val="0"/>
+        <w:keepLines w:val="0"/>
+        <w:pageBreakBefore w:val="0"/>
+        <w:widowControl w:val="1"/>
+        <w:numPr>
+          <w:ilvl w:val="0"/>
+          <w:numId w:val="1"/>
+        </w:numPr>
+        <w:pBdr>
+          <w:top w:space="0" w:sz="0" w:val="nil"/>
+          <w:left w:space="0" w:sz="0" w:val="nil"/>
+          <w:bottom w:space="0" w:sz="0" w:val="nil"/>
+          <w:right w:space="0" w:sz="0" w:val="nil"/>
+          <w:between w:space="0" w:sz="0" w:val="nil"/>
+        </w:pBdr>
+        <w:shd w:fill="auto" w:val="clear"/>
+        <w:spacing w:after="40" w:before="0" w:line="250" w:lineRule="auto"/>
+        <w:ind w:left="1037" w:right="0" w:hanging="230"/>
+        <w:jc w:val="left"/>
+        <w:rPr/>
+      </w:pPr>
+      <w:r>
+        <w:rPr>
+          <w:rFonts w:ascii="Calibri" w:cs="Calibri" w:eastAsia="Calibri" w:hAnsi="Calibri"/>
+          <w:b w:val="1"/>
+          <w:bCs w:val="1"/>
+          <w:i w:val="0"/>
+          <w:iCs w:val="0"/>
+          <w:smallCaps w:val="0"/>
+          <w:strike w:val="0"/>
+          <w:color w:val="222222"/>
+          <w:sz w:val="21"/>
+          <w:szCs w:val="21"/>
+          <w:u w:val="none"/>
+          <w:shd w:fill="auto" w:val="clear"/>
+          <w:vertAlign w:val="baseline"/>
+          <w:rtl w:val="0"/>
+        </w:rPr>
+        <w:t xml:space="preserve">Accelerated hardware-to-software readiness </w:t>
+      </w:r>
+      <w:r>
+        <w:rPr>
+          <w:rFonts w:ascii="Calibri" w:cs="Calibri" w:eastAsia="Calibri" w:hAnsi="Calibri"/>
+          <w:b w:val="0"/>
+          <w:bCs w:val="0"/>
+          <w:i w:val="0"/>
+          <w:iCs w:val="0"/>
+          <w:smallCaps w:val="0"/>
+          <w:strike w:val="0"/>
+          <w:color w:val="222222"/>
+          <w:sz w:val="21"/>
+          <w:szCs w:val="21"/>
+          <w:u w:val="none"/>
+          <w:shd w:fill="auto" w:val="clear"/>
+          <w:vertAlign w:val="baseline"/>
+          <w:rtl w:val="0"/>
+        </w:rPr>
+        <w:t xml:space="preserve">for a rapidly scaling streaming ecosystem, coordinating software deployment and issue-support infrastructure for New Product Introduction (NPI) manufacturing, component, and brand partners.</w:t>
+      </w:r>
+    </w:p>
+    <w:p>
+      <w:pPr>
+        <w:tabs>
+          <w:tab w:val="right" w:leader="none" w:pos="10080"/>
+        </w:tabs>
+        <w:spacing w:before="140" w:lineRule="auto"/>
+        <w:rPr/>
+      </w:pPr>
+      <w:r>
+        <w:rPr>
+          <w:b w:val="1"/>
+          <w:bCs w:val="1"/>
+          <w:color w:val="0f1e3d"/>
+          <w:sz w:val="23"/>
+          <w:szCs w:val="23"/>
+          <w:rtl w:val="0"/>
+        </w:rPr>
+        <w:t xml:space="preserve">AMD (Advanced Micro Devices)</w:t>
+      </w:r>
+      <w:r>
+        <w:rPr>
+          <w:i w:val="1"/>
+          <w:iCs w:val="1"/>
+          <w:color w:val="555555"/>
+          <w:sz w:val="20"/>
+          <w:szCs w:val="20"/>
+          <w:rtl w:val="0"/>
+        </w:rPr>
+        <w:tab/>
+        <w:t xml:space="preserve">June 2007 – January 2014</w:t>
+      </w:r>
+      <w:r>
+        <w:rPr>
+          <w:rtl w:val="0"/>
+        </w:rPr>
+      </w:r>
+    </w:p>
+    <w:p>
+      <w:pPr>
+        <w:spacing w:after="40" w:before="20" w:lineRule="auto"/>
+        <w:rPr/>
+      </w:pPr>
+      <w:r>
+        <w:rPr>
+          <w:b w:val="1"/>
+          <w:bCs w:val="1"/>
+          <w:i w:val="1"/>
+          <w:iCs w:val="1"/>
+          <w:color w:val="1d4ed8"/>
+          <w:sz w:val="21"/>
+          <w:szCs w:val="21"/>
+          <w:rtl w:val="0"/>
+        </w:rPr>
+        <w:t xml:space="preserve">Member of Technical Staff — SLT &amp; Burn-In Equipment Lead (progressed from Product Development Engineer I–III)</w:t>
+      </w:r>
+      <w:r>
+        <w:rPr>
+          <w:rtl w:val="0"/>
+        </w:rPr>
       </w:r>
     </w:p>
     <w:p>
@@ -1900,7 +2330,7 @@
         </w:pBdr>
         <w:shd w:fill="auto" w:val="clear"/>
         <w:spacing w:after="0" w:before="0" w:line="250" w:lineRule="auto"/>
-        <w:ind w:left="317" w:right="0" w:hanging="230"/>
+        <w:ind w:left="1037" w:right="0" w:hanging="230"/>
         <w:jc w:val="left"/>
         <w:rPr/>
       </w:pPr>
@@ -1921,26 +2351,88 @@
           <w:vertAlign w:val="baseline"/>
           <w:rtl w:val="0"/>
         </w:rPr>
-        <w:t xml:space="preserve">Scaled core platform utilization </w:t>
-      </w:r>
-      <w:r>
-        <w:rPr>
-          <w:rFonts w:ascii="Calibri" w:cs="Calibri" w:eastAsia="Calibri" w:hAnsi="Calibri"/>
-          <w:b w:val="0"/>
-          <w:bCs w:val="0"/>
-          <w:i w:val="0"/>
-          <w:iCs w:val="0"/>
-          <w:smallCaps w:val="0"/>
-          <w:strike w:val="0"/>
-          <w:color w:val="222222"/>
-          <w:sz w:val="21"/>
-          <w:szCs w:val="21"/>
-          <w:u w:val="none"/>
-          <w:shd w:fill="auto" w:val="clear"/>
-          <w:vertAlign w:val="baseline"/>
-          <w:rtl w:val="0"/>
-        </w:rPr>
-        <w:t xml:space="preserve">by migrating Salesforce Pardot onto the real-time engine (onboarding 8,000+ enterprise customers) and powering mission-critical use cases including Salesforce MFA and Vaccine Cloud.</w:t>
+        <w:t xml:space="preserve">Generated $3M in baseline bottom-line savings </w:t>
+      </w:r>
+      <w:r>
+        <w:rPr>
+          <w:rFonts w:ascii="Calibri" w:cs="Calibri" w:eastAsia="Calibri" w:hAnsi="Calibri"/>
+          <w:b w:val="0"/>
+          <w:bCs w:val="0"/>
+          <w:i w:val="0"/>
+          <w:iCs w:val="0"/>
+          <w:smallCaps w:val="0"/>
+          <w:strike w:val="0"/>
+          <w:color w:val="222222"/>
+          <w:sz w:val="21"/>
+          <w:szCs w:val="21"/>
+          <w:u w:val="none"/>
+          <w:shd w:fill="auto" w:val="clear"/>
+          <w:vertAlign w:val="baseline"/>
+          <w:rtl w:val="0"/>
+        </w:rPr>
+        <w:t xml:space="preserve">via comprehensive cost-to-coverage risk analysis, plus $750K in capital-expense savings by repurposing legacy testers for next-generation microprocessors.</w:t>
+      </w:r>
+    </w:p>
+    <w:p>
+      <w:pPr>
+        <w:keepNext w:val="0"/>
+        <w:keepLines w:val="0"/>
+        <w:pageBreakBefore w:val="0"/>
+        <w:widowControl w:val="1"/>
+        <w:numPr>
+          <w:ilvl w:val="0"/>
+          <w:numId w:val="1"/>
+        </w:numPr>
+        <w:pBdr>
+          <w:top w:space="0" w:sz="0" w:val="nil"/>
+          <w:left w:space="0" w:sz="0" w:val="nil"/>
+          <w:bottom w:space="0" w:sz="0" w:val="nil"/>
+          <w:right w:space="0" w:sz="0" w:val="nil"/>
+          <w:between w:space="0" w:sz="0" w:val="nil"/>
+        </w:pBdr>
+        <w:shd w:fill="auto" w:val="clear"/>
+        <w:spacing w:after="0" w:before="0" w:line="250" w:lineRule="auto"/>
+        <w:ind w:left="1037" w:right="0" w:hanging="230"/>
+        <w:jc w:val="left"/>
+        <w:rPr/>
+      </w:pPr>
+      <w:r>
+        <w:rPr>
+          <w:rFonts w:ascii="Calibri" w:cs="Calibri" w:eastAsia="Calibri" w:hAnsi="Calibri"/>
+          <w:b w:val="1"/>
+          <w:bCs w:val="1"/>
+          <w:i w:val="0"/>
+          <w:iCs w:val="0"/>
+          <w:smallCaps w:val="0"/>
+          <w:strike w:val="0"/>
+          <w:color w:val="222222"/>
+          <w:sz w:val="21"/>
+          <w:szCs w:val="21"/>
+          <w:u w:val="none"/>
+          <w:shd w:fill="auto" w:val="clear"/>
+          <w:vertAlign w:val="baseline"/>
+          <w:rtl w:val="0"/>
+        </w:rPr>
+        <w:t xml:space="preserve">Directed global manufacturing deployments across China, Malaysia, and Singapore </w:t>
+      </w:r>
+      <w:r>
+        <w:rPr>
+          <w:rFonts w:ascii="Calibri" w:cs="Calibri" w:eastAsia="Calibri" w:hAnsi="Calibri"/>
+          <w:b w:val="0"/>
+          <w:bCs w:val="0"/>
+          <w:i w:val="0"/>
+          <w:iCs w:val="0"/>
+          <w:smallCaps w:val="0"/>
+          <w:strike w:val="0"/>
+          <w:color w:val="222222"/>
+          <w:sz w:val="21"/>
+          <w:szCs w:val="21"/>
+          <w:u w:val="none"/>
+          <w:shd w:fill="auto" w:val="clear"/>
+          <w:vertAlign w:val="baseline"/>
+          <w:rtl w:val="0"/>
+        </w:rPr>
+        <w:t xml:space="preserve">— managing capacity fulfillment, budgets, and demanding factory KPIs — and invented a CPU socket-based voltage-controlled load emulation device that captured a 10% hidden failure rate on voltage regulators.</w:t>
       </w:r>
     </w:p>
     <w:p>
@@ -1962,7 +2454,7 @@
         </w:pBdr>
         <w:shd w:fill="auto" w:val="clear"/>
         <w:spacing w:after="40" w:before="0" w:line="250" w:lineRule="auto"/>
-        <w:ind w:left="317" w:right="0" w:hanging="230"/>
+        <w:ind w:left="1037" w:right="0" w:hanging="230"/>
         <w:jc w:val="left"/>
         <w:rPr/>
       </w:pPr>
@@ -1983,38 +2475,63 @@
           <w:vertAlign w:val="baseline"/>
           <w:rtl w:val="0"/>
         </w:rPr>
-        <w:t xml:space="preserve">Standardized developer ecosystems </w:t>
-      </w:r>
-      <w:r>
-        <w:rPr>
-          <w:rFonts w:ascii="Calibri" w:cs="Calibri" w:eastAsia="Calibri" w:hAnsi="Calibri"/>
-          <w:b w:val="0"/>
-          <w:bCs w:val="0"/>
-          <w:i w:val="0"/>
-          <w:iCs w:val="0"/>
-          <w:smallCaps w:val="0"/>
-          <w:strike w:val="0"/>
-          <w:color w:val="222222"/>
-          <w:sz w:val="21"/>
-          <w:szCs w:val="21"/>
-          <w:u w:val="none"/>
-          <w:shd w:fill="auto" w:val="clear"/>
-          <w:vertAlign w:val="baseline"/>
-          <w:rtl w:val="0"/>
-        </w:rPr>
-        <w:t xml:space="preserve">by designing a developer-centric messaging API using Swagger/OpenAPI, accelerating alignment across engineering, documentation, and sales-demonstration teams.</w:t>
-      </w:r>
-    </w:p>
-    <w:p>
-      <w:pPr>
-        <w:tabs>
-          <w:tab w:val="right" w:leader="none" w:pos="10080"/>
-        </w:tabs>
-        <w:spacing w:before="140" w:lineRule="auto"/>
-        <w:rPr/>
-      </w:pPr>
-      <w:r>
-        <w:rPr>
+        <w:t xml:space="preserve">Orchestrated multi-million-dollar capital equipment programs </w:t>
+      </w:r>
+      <w:r>
+        <w:rPr>
+          <w:rFonts w:ascii="Calibri" w:cs="Calibri" w:eastAsia="Calibri" w:hAnsi="Calibri"/>
+          <w:b w:val="0"/>
+          <w:bCs w:val="0"/>
+          <w:i w:val="0"/>
+          <w:iCs w:val="0"/>
+          <w:smallCaps w:val="0"/>
+          <w:strike w:val="0"/>
+          <w:color w:val="222222"/>
+          <w:sz w:val="21"/>
+          <w:szCs w:val="21"/>
+          <w:u w:val="none"/>
+          <w:shd w:fill="auto" w:val="clear"/>
+          <w:vertAlign w:val="baseline"/>
+          <w:rtl w:val="0"/>
+        </w:rPr>
+        <w:t xml:space="preserve">as technical lead and project manager for end-to-end microprocessor tester lifecycles, driving DMAIC-based process excellence as cross-program Equipment Integration Lead.</w:t>
+      </w:r>
+    </w:p>
+    <w:p>
+      <w:pPr>
+        <w:spacing w:after="0" w:before="80" w:lineRule="auto"/>
+        <w:rPr/>
+      </w:pPr>
+      <w:r>
+        <w:rPr>
+          <w:b w:val="0"/>
+          <w:bCs w:val="0"/>
+          <w:i w:val="1"/>
+          <w:iCs w:val="1"/>
+          <w:color w:val="555555"/>
+          <w:sz w:val="19"/>
+          <w:szCs w:val="19"/>
+          <w:rtl w:val="0"/>
+        </w:rPr>
+        <w:t xml:space="preserve">Early Career:  Whirlpool Corporation (Electronic Control &amp; Design Intern) · Motorola Solutions (Machine Shop Intern)</w:t>
+      </w:r>
+      <w:r>
+        <w:rPr>
+          <w:rtl w:val="0"/>
+        </w:rPr>
+      </w:r>
+    </w:p>
+    <w:p>
+      <w:pPr>
+        <w:pBdr>
+          <w:bottom w:color="0f1e3d" w:space="3" w:sz="8" w:val="single"/>
+        </w:pBdr>
+        <w:spacing w:after="80" w:before="220" w:lineRule="auto"/>
+        <w:rPr/>
+      </w:pPr>
+      <w:r>
+        <w:rPr>
+          <w:rFonts w:ascii="Calibri" w:cs="Calibri" w:eastAsia="Calibri" w:hAnsi="Calibri"/>
           <w:b w:val="1"/>
           <w:bCs w:val="1"/>
           <w:color w:val="0f1e3d"/>
@@ -2022,43 +2539,7 @@
           <w:szCs w:val="23"/>
           <w:rtl w:val="0"/>
         </w:rPr>
-        <w:t xml:space="preserve">TERADATA</w:t>
-      </w:r>
-      <w:r>
-        <w:rPr>
-          <w:i w:val="1"/>
-          <w:iCs w:val="1"/>
-          <w:color w:val="555555"/>
-          <w:sz w:val="20"/>
-          <w:szCs w:val="20"/>
-          <w:rtl w:val="0"/>
-        </w:rPr>
-        <w:tab/>
-        <w:t xml:space="preserve">October 2014 – November 2016</w:t>
-      </w:r>
-      <w:r>
-        <w:rPr>
-          <w:rtl w:val="0"/>
-        </w:rPr>
-      </w:r>
-    </w:p>
-    <w:p>
-      <w:pPr>
-        <w:spacing w:after="40" w:before="20" w:lineRule="auto"/>
-        <w:rPr/>
-      </w:pPr>
-      <w:r>
-        <w:rPr>
-          <w:b w:val="1"/>
-          <w:bCs w:val="1"/>
-          <w:i w:val="1"/>
-          <w:iCs w:val="1"/>
-          <w:color w:val="1d4ed8"/>
-          <w:sz w:val="21"/>
-          <w:szCs w:val="21"/>
-          <w:rtl w:val="0"/>
-        </w:rPr>
-        <w:t xml:space="preserve">Product Manager &amp; Scrum Product Owner — Intellisphere Data Ingestion</w:t>
+        <w:t xml:space="preserve">PATENTS &amp; PUBLICATIONS</w:t>
       </w:r>
       <w:r>
         <w:rPr>
@@ -2085,7 +2566,7 @@
         </w:pBdr>
         <w:shd w:fill="auto" w:val="clear"/>
         <w:spacing w:after="0" w:before="0" w:line="250" w:lineRule="auto"/>
-        <w:ind w:left="317" w:right="0" w:hanging="230"/>
+        <w:ind w:left="1037" w:right="0" w:hanging="230"/>
         <w:jc w:val="left"/>
         <w:rPr/>
       </w:pPr>
@@ -2106,26 +2587,88 @@
           <w:vertAlign w:val="baseline"/>
           <w:rtl w:val="0"/>
         </w:rPr>
-        <w:t xml:space="preserve">Commercialized enterprise big-data orchestration software </w:t>
-      </w:r>
-      <w:r>
-        <w:rPr>
-          <w:rFonts w:ascii="Calibri" w:cs="Calibri" w:eastAsia="Calibri" w:hAnsi="Calibri"/>
-          <w:b w:val="0"/>
-          <w:bCs w:val="0"/>
-          <w:i w:val="0"/>
-          <w:iCs w:val="0"/>
-          <w:smallCaps w:val="0"/>
-          <w:strike w:val="0"/>
-          <w:color w:val="222222"/>
-          <w:sz w:val="21"/>
-          <w:szCs w:val="21"/>
-          <w:u w:val="none"/>
-          <w:shd w:fill="auto" w:val="clear"/>
-          <w:vertAlign w:val="baseline"/>
-          <w:rtl w:val="0"/>
-        </w:rPr>
-        <w:t xml:space="preserve">as end-to-end vision and GTM owner for Teradata Listener, building an elastic, cloud-native microservices architecture for real-time ingestion.</w:t>
+        <w:t xml:space="preserve">Patent: </w:t>
+      </w:r>
+      <w:r>
+        <w:rPr>
+          <w:rFonts w:ascii="Calibri" w:cs="Calibri" w:eastAsia="Calibri" w:hAnsi="Calibri"/>
+          <w:b w:val="0"/>
+          <w:bCs w:val="0"/>
+          <w:i w:val="0"/>
+          <w:iCs w:val="0"/>
+          <w:smallCaps w:val="0"/>
+          <w:strike w:val="0"/>
+          <w:color w:val="222222"/>
+          <w:sz w:val="21"/>
+          <w:szCs w:val="21"/>
+          <w:u w:val="none"/>
+          <w:shd w:fill="auto" w:val="clear"/>
+          <w:vertAlign w:val="baseline"/>
+          <w:rtl w:val="0"/>
+        </w:rPr>
+        <w:t xml:space="preserve">Machine Learning Generation and Refinement of Group Messaging in a Database System via Generative Language Modeling — US 2025-0086403 A1 (filed Jan 2024).</w:t>
+      </w:r>
+    </w:p>
+    <w:p>
+      <w:pPr>
+        <w:keepNext w:val="0"/>
+        <w:keepLines w:val="0"/>
+        <w:pageBreakBefore w:val="0"/>
+        <w:widowControl w:val="1"/>
+        <w:numPr>
+          <w:ilvl w:val="0"/>
+          <w:numId w:val="1"/>
+        </w:numPr>
+        <w:pBdr>
+          <w:top w:space="0" w:sz="0" w:val="nil"/>
+          <w:left w:space="0" w:sz="0" w:val="nil"/>
+          <w:bottom w:space="0" w:sz="0" w:val="nil"/>
+          <w:right w:space="0" w:sz="0" w:val="nil"/>
+          <w:between w:space="0" w:sz="0" w:val="nil"/>
+        </w:pBdr>
+        <w:shd w:fill="auto" w:val="clear"/>
+        <w:spacing w:after="0" w:before="0" w:line="250" w:lineRule="auto"/>
+        <w:ind w:left="1037" w:right="0" w:hanging="230"/>
+        <w:jc w:val="left"/>
+        <w:rPr/>
+      </w:pPr>
+      <w:r>
+        <w:rPr>
+          <w:rFonts w:ascii="Calibri" w:cs="Calibri" w:eastAsia="Calibri" w:hAnsi="Calibri"/>
+          <w:b w:val="1"/>
+          <w:bCs w:val="1"/>
+          <w:i w:val="0"/>
+          <w:iCs w:val="0"/>
+          <w:smallCaps w:val="0"/>
+          <w:strike w:val="0"/>
+          <w:color w:val="222222"/>
+          <w:sz w:val="21"/>
+          <w:szCs w:val="21"/>
+          <w:u w:val="none"/>
+          <w:shd w:fill="auto" w:val="clear"/>
+          <w:vertAlign w:val="baseline"/>
+          <w:rtl w:val="0"/>
+        </w:rPr>
+        <w:t xml:space="preserve">Patent: </w:t>
+      </w:r>
+      <w:r>
+        <w:rPr>
+          <w:rFonts w:ascii="Calibri" w:cs="Calibri" w:eastAsia="Calibri" w:hAnsi="Calibri"/>
+          <w:b w:val="0"/>
+          <w:bCs w:val="0"/>
+          <w:i w:val="0"/>
+          <w:iCs w:val="0"/>
+          <w:smallCaps w:val="0"/>
+          <w:strike w:val="0"/>
+          <w:color w:val="222222"/>
+          <w:sz w:val="21"/>
+          <w:szCs w:val="21"/>
+          <w:u w:val="none"/>
+          <w:shd w:fill="auto" w:val="clear"/>
+          <w:vertAlign w:val="baseline"/>
+          <w:rtl w:val="0"/>
+        </w:rPr>
+        <w:t xml:space="preserve">Techniques for Automatic Subject Line Generation — US 20240303280 A1 (filed May 2023).</w:t>
       </w:r>
     </w:p>
     <w:p>
@@ -2147,613 +2690,7 @@
         </w:pBdr>
         <w:shd w:fill="auto" w:val="clear"/>
         <w:spacing w:after="40" w:before="0" w:line="250" w:lineRule="auto"/>
-        <w:ind w:left="317" w:right="0" w:hanging="230"/>
-        <w:jc w:val="left"/>
-        <w:rPr/>
-      </w:pPr>
-      <w:r>
-        <w:rPr>
-          <w:rFonts w:ascii="Calibri" w:cs="Calibri" w:eastAsia="Calibri" w:hAnsi="Calibri"/>
-          <w:b w:val="1"/>
-          <w:bCs w:val="1"/>
-          <w:i w:val="0"/>
-          <w:iCs w:val="0"/>
-          <w:smallCaps w:val="0"/>
-          <w:strike w:val="0"/>
-          <w:color w:val="222222"/>
-          <w:sz w:val="21"/>
-          <w:szCs w:val="21"/>
-          <w:u w:val="none"/>
-          <w:shd w:fill="auto" w:val="clear"/>
-          <w:vertAlign w:val="baseline"/>
-          <w:rtl w:val="0"/>
-        </w:rPr>
-        <w:t xml:space="preserve">Slashed big-data connection latency to under 5 minutes </w:t>
-      </w:r>
-      <w:r>
-        <w:rPr>
-          <w:rFonts w:ascii="Calibri" w:cs="Calibri" w:eastAsia="Calibri" w:hAnsi="Calibri"/>
-          <w:b w:val="0"/>
-          <w:bCs w:val="0"/>
-          <w:i w:val="0"/>
-          <w:iCs w:val="0"/>
-          <w:smallCaps w:val="0"/>
-          <w:strike w:val="0"/>
-          <w:color w:val="222222"/>
-          <w:sz w:val="21"/>
-          <w:szCs w:val="21"/>
-          <w:u w:val="none"/>
-          <w:shd w:fill="auto" w:val="clear"/>
-          <w:vertAlign w:val="baseline"/>
-          <w:rtl w:val="0"/>
-        </w:rPr>
-        <w:t xml:space="preserve">by abstracting complex open-source streaming frameworks (Kafka, Confluent, ElasticDB, Kubernetes) into accessible Java/Go REST services and unified user interfaces.</w:t>
-      </w:r>
-    </w:p>
-    <w:p>
-      <w:pPr>
-        <w:tabs>
-          <w:tab w:val="right" w:leader="none" w:pos="10080"/>
-        </w:tabs>
-        <w:spacing w:before="140" w:lineRule="auto"/>
-        <w:rPr/>
-      </w:pPr>
-      <w:r>
-        <w:rPr>
-          <w:b w:val="1"/>
-          <w:bCs w:val="1"/>
-          <w:color w:val="0f1e3d"/>
-          <w:sz w:val="23"/>
-          <w:szCs w:val="23"/>
-          <w:rtl w:val="0"/>
-        </w:rPr>
-        <w:t xml:space="preserve">ROKU</w:t>
-      </w:r>
-      <w:r>
-        <w:rPr>
-          <w:i w:val="1"/>
-          <w:iCs w:val="1"/>
-          <w:color w:val="555555"/>
-          <w:sz w:val="20"/>
-          <w:szCs w:val="20"/>
-          <w:rtl w:val="0"/>
-        </w:rPr>
-        <w:tab/>
-        <w:t xml:space="preserve">January 2014 – October 2014</w:t>
-      </w:r>
-      <w:r>
-        <w:rPr>
-          <w:rtl w:val="0"/>
-        </w:rPr>
-      </w:r>
-    </w:p>
-    <w:p>
-      <w:pPr>
-        <w:spacing w:after="40" w:before="20" w:lineRule="auto"/>
-        <w:rPr/>
-      </w:pPr>
-      <w:r>
-        <w:rPr>
-          <w:b w:val="1"/>
-          <w:bCs w:val="1"/>
-          <w:i w:val="1"/>
-          <w:iCs w:val="1"/>
-          <w:color w:val="1d4ed8"/>
-          <w:sz w:val="21"/>
-          <w:szCs w:val="21"/>
-          <w:rtl w:val="0"/>
-        </w:rPr>
-        <w:t xml:space="preserve">Product Software Partner Manager</w:t>
-      </w:r>
-      <w:r>
-        <w:rPr>
-          <w:rtl w:val="0"/>
-        </w:rPr>
-      </w:r>
-    </w:p>
-    <w:p>
-      <w:pPr>
-        <w:keepNext w:val="0"/>
-        <w:keepLines w:val="0"/>
-        <w:pageBreakBefore w:val="0"/>
-        <w:widowControl w:val="1"/>
-        <w:numPr>
-          <w:ilvl w:val="0"/>
-          <w:numId w:val="1"/>
-        </w:numPr>
-        <w:pBdr>
-          <w:top w:space="0" w:sz="0" w:val="nil"/>
-          <w:left w:space="0" w:sz="0" w:val="nil"/>
-          <w:bottom w:space="0" w:sz="0" w:val="nil"/>
-          <w:right w:space="0" w:sz="0" w:val="nil"/>
-          <w:between w:space="0" w:sz="0" w:val="nil"/>
-        </w:pBdr>
-        <w:shd w:fill="auto" w:val="clear"/>
-        <w:spacing w:after="40" w:before="0" w:line="250" w:lineRule="auto"/>
-        <w:ind w:left="317" w:right="0" w:hanging="230"/>
-        <w:jc w:val="left"/>
-        <w:rPr/>
-      </w:pPr>
-      <w:r>
-        <w:rPr>
-          <w:rFonts w:ascii="Calibri" w:cs="Calibri" w:eastAsia="Calibri" w:hAnsi="Calibri"/>
-          <w:b w:val="1"/>
-          <w:bCs w:val="1"/>
-          <w:i w:val="0"/>
-          <w:iCs w:val="0"/>
-          <w:smallCaps w:val="0"/>
-          <w:strike w:val="0"/>
-          <w:color w:val="222222"/>
-          <w:sz w:val="21"/>
-          <w:szCs w:val="21"/>
-          <w:u w:val="none"/>
-          <w:shd w:fill="auto" w:val="clear"/>
-          <w:vertAlign w:val="baseline"/>
-          <w:rtl w:val="0"/>
-        </w:rPr>
-        <w:t xml:space="preserve">Accelerated hardware-to-software readiness </w:t>
-      </w:r>
-      <w:r>
-        <w:rPr>
-          <w:rFonts w:ascii="Calibri" w:cs="Calibri" w:eastAsia="Calibri" w:hAnsi="Calibri"/>
-          <w:b w:val="0"/>
-          <w:bCs w:val="0"/>
-          <w:i w:val="0"/>
-          <w:iCs w:val="0"/>
-          <w:smallCaps w:val="0"/>
-          <w:strike w:val="0"/>
-          <w:color w:val="222222"/>
-          <w:sz w:val="21"/>
-          <w:szCs w:val="21"/>
-          <w:u w:val="none"/>
-          <w:shd w:fill="auto" w:val="clear"/>
-          <w:vertAlign w:val="baseline"/>
-          <w:rtl w:val="0"/>
-        </w:rPr>
-        <w:t xml:space="preserve">for a rapidly scaling streaming ecosystem, coordinating software deployment and issue-support infrastructure for New Product Introduction (NPI) manufacturing, component, and brand partners.</w:t>
-      </w:r>
-    </w:p>
-    <w:p>
-      <w:pPr>
-        <w:tabs>
-          <w:tab w:val="right" w:leader="none" w:pos="10080"/>
-        </w:tabs>
-        <w:spacing w:before="140" w:lineRule="auto"/>
-        <w:rPr/>
-      </w:pPr>
-      <w:r>
-        <w:rPr>
-          <w:b w:val="1"/>
-          <w:bCs w:val="1"/>
-          <w:color w:val="0f1e3d"/>
-          <w:sz w:val="23"/>
-          <w:szCs w:val="23"/>
-          <w:rtl w:val="0"/>
-        </w:rPr>
-        <w:t xml:space="preserve">AMD (Advanced Micro Devices)</w:t>
-      </w:r>
-      <w:r>
-        <w:rPr>
-          <w:i w:val="1"/>
-          <w:iCs w:val="1"/>
-          <w:color w:val="555555"/>
-          <w:sz w:val="20"/>
-          <w:szCs w:val="20"/>
-          <w:rtl w:val="0"/>
-        </w:rPr>
-        <w:tab/>
-        <w:t xml:space="preserve">June 2007 – January 2014</w:t>
-      </w:r>
-      <w:r>
-        <w:rPr>
-          <w:rtl w:val="0"/>
-        </w:rPr>
-      </w:r>
-    </w:p>
-    <w:p>
-      <w:pPr>
-        <w:spacing w:after="40" w:before="20" w:lineRule="auto"/>
-        <w:rPr/>
-      </w:pPr>
-      <w:r>
-        <w:rPr>
-          <w:b w:val="1"/>
-          <w:bCs w:val="1"/>
-          <w:i w:val="1"/>
-          <w:iCs w:val="1"/>
-          <w:color w:val="1d4ed8"/>
-          <w:sz w:val="21"/>
-          <w:szCs w:val="21"/>
-          <w:rtl w:val="0"/>
-        </w:rPr>
-        <w:t xml:space="preserve">Member of Technical Staff — SLT &amp; Burn-In Equipment Lead (progressed from Product Development Engineer I–III)</w:t>
-      </w:r>
-      <w:r>
-        <w:rPr>
-          <w:rtl w:val="0"/>
-        </w:rPr>
-      </w:r>
-    </w:p>
-    <w:p>
-      <w:pPr>
-        <w:keepNext w:val="0"/>
-        <w:keepLines w:val="0"/>
-        <w:pageBreakBefore w:val="0"/>
-        <w:widowControl w:val="1"/>
-        <w:numPr>
-          <w:ilvl w:val="0"/>
-          <w:numId w:val="1"/>
-        </w:numPr>
-        <w:pBdr>
-          <w:top w:space="0" w:sz="0" w:val="nil"/>
-          <w:left w:space="0" w:sz="0" w:val="nil"/>
-          <w:bottom w:space="0" w:sz="0" w:val="nil"/>
-          <w:right w:space="0" w:sz="0" w:val="nil"/>
-          <w:between w:space="0" w:sz="0" w:val="nil"/>
-        </w:pBdr>
-        <w:shd w:fill="auto" w:val="clear"/>
-        <w:spacing w:after="0" w:before="0" w:line="250" w:lineRule="auto"/>
-        <w:ind w:left="317" w:right="0" w:hanging="230"/>
-        <w:jc w:val="left"/>
-        <w:rPr/>
-      </w:pPr>
-      <w:r>
-        <w:rPr>
-          <w:rFonts w:ascii="Calibri" w:cs="Calibri" w:eastAsia="Calibri" w:hAnsi="Calibri"/>
-          <w:b w:val="1"/>
-          <w:bCs w:val="1"/>
-          <w:i w:val="0"/>
-          <w:iCs w:val="0"/>
-          <w:smallCaps w:val="0"/>
-          <w:strike w:val="0"/>
-          <w:color w:val="222222"/>
-          <w:sz w:val="21"/>
-          <w:szCs w:val="21"/>
-          <w:u w:val="none"/>
-          <w:shd w:fill="auto" w:val="clear"/>
-          <w:vertAlign w:val="baseline"/>
-          <w:rtl w:val="0"/>
-        </w:rPr>
-        <w:t xml:space="preserve">Generated $3M in baseline bottom-line savings </w:t>
-      </w:r>
-      <w:r>
-        <w:rPr>
-          <w:rFonts w:ascii="Calibri" w:cs="Calibri" w:eastAsia="Calibri" w:hAnsi="Calibri"/>
-          <w:b w:val="0"/>
-          <w:bCs w:val="0"/>
-          <w:i w:val="0"/>
-          <w:iCs w:val="0"/>
-          <w:smallCaps w:val="0"/>
-          <w:strike w:val="0"/>
-          <w:color w:val="222222"/>
-          <w:sz w:val="21"/>
-          <w:szCs w:val="21"/>
-          <w:u w:val="none"/>
-          <w:shd w:fill="auto" w:val="clear"/>
-          <w:vertAlign w:val="baseline"/>
-          <w:rtl w:val="0"/>
-        </w:rPr>
-        <w:t xml:space="preserve">via comprehensive cost-to-coverage risk analysis, plus $750K in capital-expense savings by repurposing legacy testers for next-generation microprocessors.</w:t>
-      </w:r>
-    </w:p>
-    <w:p>
-      <w:pPr>
-        <w:keepNext w:val="0"/>
-        <w:keepLines w:val="0"/>
-        <w:pageBreakBefore w:val="0"/>
-        <w:widowControl w:val="1"/>
-        <w:numPr>
-          <w:ilvl w:val="0"/>
-          <w:numId w:val="1"/>
-        </w:numPr>
-        <w:pBdr>
-          <w:top w:space="0" w:sz="0" w:val="nil"/>
-          <w:left w:space="0" w:sz="0" w:val="nil"/>
-          <w:bottom w:space="0" w:sz="0" w:val="nil"/>
-          <w:right w:space="0" w:sz="0" w:val="nil"/>
-          <w:between w:space="0" w:sz="0" w:val="nil"/>
-        </w:pBdr>
-        <w:shd w:fill="auto" w:val="clear"/>
-        <w:spacing w:after="0" w:before="0" w:line="250" w:lineRule="auto"/>
-        <w:ind w:left="317" w:right="0" w:hanging="230"/>
-        <w:jc w:val="left"/>
-        <w:rPr/>
-      </w:pPr>
-      <w:r>
-        <w:rPr>
-          <w:rFonts w:ascii="Calibri" w:cs="Calibri" w:eastAsia="Calibri" w:hAnsi="Calibri"/>
-          <w:b w:val="1"/>
-          <w:bCs w:val="1"/>
-          <w:i w:val="0"/>
-          <w:iCs w:val="0"/>
-          <w:smallCaps w:val="0"/>
-          <w:strike w:val="0"/>
-          <w:color w:val="222222"/>
-          <w:sz w:val="21"/>
-          <w:szCs w:val="21"/>
-          <w:u w:val="none"/>
-          <w:shd w:fill="auto" w:val="clear"/>
-          <w:vertAlign w:val="baseline"/>
-          <w:rtl w:val="0"/>
-        </w:rPr>
-        <w:t xml:space="preserve">Directed global manufacturing deployments across China, Malaysia, and Singapore </w:t>
-      </w:r>
-      <w:r>
-        <w:rPr>
-          <w:rFonts w:ascii="Calibri" w:cs="Calibri" w:eastAsia="Calibri" w:hAnsi="Calibri"/>
-          <w:b w:val="0"/>
-          <w:bCs w:val="0"/>
-          <w:i w:val="0"/>
-          <w:iCs w:val="0"/>
-          <w:smallCaps w:val="0"/>
-          <w:strike w:val="0"/>
-          <w:color w:val="222222"/>
-          <w:sz w:val="21"/>
-          <w:szCs w:val="21"/>
-          <w:u w:val="none"/>
-          <w:shd w:fill="auto" w:val="clear"/>
-          <w:vertAlign w:val="baseline"/>
-          <w:rtl w:val="0"/>
-        </w:rPr>
-        <w:t xml:space="preserve">— managing capacity fulfillment, budgets, and demanding factory KPIs — and invented a CPU socket-based voltage-controlled load emulation device that captured a 10% hidden failure rate on voltage regulators.</w:t>
-      </w:r>
-    </w:p>
-    <w:p>
-      <w:pPr>
-        <w:keepNext w:val="0"/>
-        <w:keepLines w:val="0"/>
-        <w:pageBreakBefore w:val="0"/>
-        <w:widowControl w:val="1"/>
-        <w:numPr>
-          <w:ilvl w:val="0"/>
-          <w:numId w:val="1"/>
-        </w:numPr>
-        <w:pBdr>
-          <w:top w:space="0" w:sz="0" w:val="nil"/>
-          <w:left w:space="0" w:sz="0" w:val="nil"/>
-          <w:bottom w:space="0" w:sz="0" w:val="nil"/>
-          <w:right w:space="0" w:sz="0" w:val="nil"/>
-          <w:between w:space="0" w:sz="0" w:val="nil"/>
-        </w:pBdr>
-        <w:shd w:fill="auto" w:val="clear"/>
-        <w:spacing w:after="40" w:before="0" w:line="250" w:lineRule="auto"/>
-        <w:ind w:left="317" w:right="0" w:hanging="230"/>
-        <w:jc w:val="left"/>
-        <w:rPr/>
-      </w:pPr>
-      <w:r>
-        <w:rPr>
-          <w:rFonts w:ascii="Calibri" w:cs="Calibri" w:eastAsia="Calibri" w:hAnsi="Calibri"/>
-          <w:b w:val="1"/>
-          <w:bCs w:val="1"/>
-          <w:i w:val="0"/>
-          <w:iCs w:val="0"/>
-          <w:smallCaps w:val="0"/>
-          <w:strike w:val="0"/>
-          <w:color w:val="222222"/>
-          <w:sz w:val="21"/>
-          <w:szCs w:val="21"/>
-          <w:u w:val="none"/>
-          <w:shd w:fill="auto" w:val="clear"/>
-          <w:vertAlign w:val="baseline"/>
-          <w:rtl w:val="0"/>
-        </w:rPr>
-        <w:t xml:space="preserve">Orchestrated multi-million-dollar capital equipment programs </w:t>
-      </w:r>
-      <w:r>
-        <w:rPr>
-          <w:rFonts w:ascii="Calibri" w:cs="Calibri" w:eastAsia="Calibri" w:hAnsi="Calibri"/>
-          <w:b w:val="0"/>
-          <w:bCs w:val="0"/>
-          <w:i w:val="0"/>
-          <w:iCs w:val="0"/>
-          <w:smallCaps w:val="0"/>
-          <w:strike w:val="0"/>
-          <w:color w:val="222222"/>
-          <w:sz w:val="21"/>
-          <w:szCs w:val="21"/>
-          <w:u w:val="none"/>
-          <w:shd w:fill="auto" w:val="clear"/>
-          <w:vertAlign w:val="baseline"/>
-          <w:rtl w:val="0"/>
-        </w:rPr>
-        <w:t xml:space="preserve">as technical lead and project manager for end-to-end microprocessor tester lifecycles, driving DMAIC-based process excellence as cross-program Equipment Integration Lead.</w:t>
-      </w:r>
-    </w:p>
-    <w:p>
-      <w:pPr>
-        <w:spacing w:after="0" w:before="80" w:lineRule="auto"/>
-        <w:rPr/>
-      </w:pPr>
-      <w:r>
-        <w:rPr>
-          <w:b w:val="0"/>
-          <w:bCs w:val="0"/>
-          <w:i w:val="1"/>
-          <w:iCs w:val="1"/>
-          <w:color w:val="555555"/>
-          <w:sz w:val="19"/>
-          <w:szCs w:val="19"/>
-          <w:rtl w:val="0"/>
-        </w:rPr>
-        <w:t xml:space="preserve">Early Career:  Whirlpool Corporation (Electronic Control &amp; Design Intern) · Motorola Solutions (Machine Shop Intern)</w:t>
-      </w:r>
-      <w:r>
-        <w:rPr>
-          <w:rtl w:val="0"/>
-        </w:rPr>
-      </w:r>
-    </w:p>
-    <w:p>
-      <w:pPr>
-        <w:pBdr>
-          <w:bottom w:color="0f1e3d" w:space="3" w:sz="8" w:val="single"/>
-        </w:pBdr>
-        <w:spacing w:after="80" w:before="220" w:lineRule="auto"/>
-        <w:rPr/>
-      </w:pPr>
-      <w:r>
-        <w:rPr>
-          <w:rFonts w:ascii="Calibri" w:cs="Calibri" w:eastAsia="Calibri" w:hAnsi="Calibri"/>
-          <w:b w:val="1"/>
-          <w:bCs w:val="1"/>
-          <w:color w:val="0f1e3d"/>
-          <w:sz w:val="23"/>
-          <w:szCs w:val="23"/>
-          <w:rtl w:val="0"/>
-        </w:rPr>
-        <w:t xml:space="preserve">PATENTS &amp; PUBLICATIONS</w:t>
-      </w:r>
-      <w:r>
-        <w:rPr>
-          <w:rtl w:val="0"/>
-        </w:rPr>
-      </w:r>
-    </w:p>
-    <w:p>
-      <w:pPr>
-        <w:keepNext w:val="0"/>
-        <w:keepLines w:val="0"/>
-        <w:pageBreakBefore w:val="0"/>
-        <w:widowControl w:val="1"/>
-        <w:numPr>
-          <w:ilvl w:val="0"/>
-          <w:numId w:val="1"/>
-        </w:numPr>
-        <w:pBdr>
-          <w:top w:space="0" w:sz="0" w:val="nil"/>
-          <w:left w:space="0" w:sz="0" w:val="nil"/>
-          <w:bottom w:space="0" w:sz="0" w:val="nil"/>
-          <w:right w:space="0" w:sz="0" w:val="nil"/>
-          <w:between w:space="0" w:sz="0" w:val="nil"/>
-        </w:pBdr>
-        <w:shd w:fill="auto" w:val="clear"/>
-        <w:spacing w:after="0" w:before="0" w:line="250" w:lineRule="auto"/>
-        <w:ind w:left="317" w:right="0" w:hanging="230"/>
-        <w:jc w:val="left"/>
-        <w:rPr/>
-      </w:pPr>
-      <w:r>
-        <w:rPr>
-          <w:rFonts w:ascii="Calibri" w:cs="Calibri" w:eastAsia="Calibri" w:hAnsi="Calibri"/>
-          <w:b w:val="1"/>
-          <w:bCs w:val="1"/>
-          <w:i w:val="0"/>
-          <w:iCs w:val="0"/>
-          <w:smallCaps w:val="0"/>
-          <w:strike w:val="0"/>
-          <w:color w:val="222222"/>
-          <w:sz w:val="21"/>
-          <w:szCs w:val="21"/>
-          <w:u w:val="none"/>
-          <w:shd w:fill="auto" w:val="clear"/>
-          <w:vertAlign w:val="baseline"/>
-          <w:rtl w:val="0"/>
-        </w:rPr>
-        <w:t xml:space="preserve">Patent: </w:t>
-      </w:r>
-      <w:r>
-        <w:rPr>
-          <w:rFonts w:ascii="Calibri" w:cs="Calibri" w:eastAsia="Calibri" w:hAnsi="Calibri"/>
-          <w:b w:val="0"/>
-          <w:bCs w:val="0"/>
-          <w:i w:val="0"/>
-          <w:iCs w:val="0"/>
-          <w:smallCaps w:val="0"/>
-          <w:strike w:val="0"/>
-          <w:color w:val="222222"/>
-          <w:sz w:val="21"/>
-          <w:szCs w:val="21"/>
-          <w:u w:val="none"/>
-          <w:shd w:fill="auto" w:val="clear"/>
-          <w:vertAlign w:val="baseline"/>
-          <w:rtl w:val="0"/>
-        </w:rPr>
-        <w:t xml:space="preserve">Machine Learning Generation and Refinement of Group Messaging in a Database System via Generative Language Modeling — US 2025-0086403 A1 (filed Jan 2024).</w:t>
-      </w:r>
-    </w:p>
-    <w:p>
-      <w:pPr>
-        <w:keepNext w:val="0"/>
-        <w:keepLines w:val="0"/>
-        <w:pageBreakBefore w:val="0"/>
-        <w:widowControl w:val="1"/>
-        <w:numPr>
-          <w:ilvl w:val="0"/>
-          <w:numId w:val="1"/>
-        </w:numPr>
-        <w:pBdr>
-          <w:top w:space="0" w:sz="0" w:val="nil"/>
-          <w:left w:space="0" w:sz="0" w:val="nil"/>
-          <w:bottom w:space="0" w:sz="0" w:val="nil"/>
-          <w:right w:space="0" w:sz="0" w:val="nil"/>
-          <w:between w:space="0" w:sz="0" w:val="nil"/>
-        </w:pBdr>
-        <w:shd w:fill="auto" w:val="clear"/>
-        <w:spacing w:after="0" w:before="0" w:line="250" w:lineRule="auto"/>
-        <w:ind w:left="317" w:right="0" w:hanging="230"/>
-        <w:jc w:val="left"/>
-        <w:rPr/>
-      </w:pPr>
-      <w:r>
-        <w:rPr>
-          <w:rFonts w:ascii="Calibri" w:cs="Calibri" w:eastAsia="Calibri" w:hAnsi="Calibri"/>
-          <w:b w:val="1"/>
-          <w:bCs w:val="1"/>
-          <w:i w:val="0"/>
-          <w:iCs w:val="0"/>
-          <w:smallCaps w:val="0"/>
-          <w:strike w:val="0"/>
-          <w:color w:val="222222"/>
-          <w:sz w:val="21"/>
-          <w:szCs w:val="21"/>
-          <w:u w:val="none"/>
-          <w:shd w:fill="auto" w:val="clear"/>
-          <w:vertAlign w:val="baseline"/>
-          <w:rtl w:val="0"/>
-        </w:rPr>
-        <w:t xml:space="preserve">Patent: </w:t>
-      </w:r>
-      <w:r>
-        <w:rPr>
-          <w:rFonts w:ascii="Calibri" w:cs="Calibri" w:eastAsia="Calibri" w:hAnsi="Calibri"/>
-          <w:b w:val="0"/>
-          <w:bCs w:val="0"/>
-          <w:i w:val="0"/>
-          <w:iCs w:val="0"/>
-          <w:smallCaps w:val="0"/>
-          <w:strike w:val="0"/>
-          <w:color w:val="222222"/>
-          <w:sz w:val="21"/>
-          <w:szCs w:val="21"/>
-          <w:u w:val="none"/>
-          <w:shd w:fill="auto" w:val="clear"/>
-          <w:vertAlign w:val="baseline"/>
-          <w:rtl w:val="0"/>
-        </w:rPr>
-        <w:t xml:space="preserve">Techniques for Automatic Subject Line Generation — US 20240303280 A1 (filed May 2023).</w:t>
-      </w:r>
-    </w:p>
-    <w:p>
-      <w:pPr>
-        <w:keepNext w:val="0"/>
-        <w:keepLines w:val="0"/>
-        <w:pageBreakBefore w:val="0"/>
-        <w:widowControl w:val="1"/>
-        <w:numPr>
-          <w:ilvl w:val="0"/>
-          <w:numId w:val="1"/>
-        </w:numPr>
-        <w:pBdr>
-          <w:top w:space="0" w:sz="0" w:val="nil"/>
-          <w:left w:space="0" w:sz="0" w:val="nil"/>
-          <w:bottom w:space="0" w:sz="0" w:val="nil"/>
-          <w:right w:space="0" w:sz="0" w:val="nil"/>
-          <w:between w:space="0" w:sz="0" w:val="nil"/>
-        </w:pBdr>
-        <w:shd w:fill="auto" w:val="clear"/>
-        <w:spacing w:after="40" w:before="0" w:line="250" w:lineRule="auto"/>
-        <w:ind w:left="317" w:right="0" w:hanging="230"/>
+        <w:ind w:left="1037" w:right="0" w:hanging="230"/>
         <w:jc w:val="left"/>
         <w:rPr/>
       </w:pPr>
@@ -2884,7 +2821,7 @@
       <w:lvlText w:val="●"/>
       <w:lvlJc w:val="left"/>
       <w:pPr>
-        <w:ind w:left="360" w:hanging="360"/>
+        <w:ind w:left="1080" w:hanging="360"/>
       </w:pPr>
       <w:rPr>
         <w:rFonts w:ascii="Noto Sans Symbols" w:cs="Noto Sans Symbols" w:eastAsia="Noto Sans Symbols" w:hAnsi="Noto Sans Symbols"/>
@@ -2896,7 +2833,7 @@
       <w:lvlText w:val=""/>
       <w:lvlJc w:val="left"/>
       <w:pPr>
-        <w:ind w:left="0" w:firstLine="0"/>
+        <w:ind w:left="720" w:firstLine="0"/>
       </w:pPr>
       <w:rPr/>
     </w:lvl>
@@ -2906,7 +2843,7 @@
       <w:lvlText w:val=""/>
       <w:lvlJc w:val="left"/>
       <w:pPr>
-        <w:ind w:left="0" w:firstLine="0"/>
+        <w:ind w:left="720" w:firstLine="0"/>
       </w:pPr>
       <w:rPr/>
     </w:lvl>
@@ -2916,7 +2853,7 @@
       <w:lvlText w:val=""/>
       <w:lvlJc w:val="left"/>
       <w:pPr>
-        <w:ind w:left="0" w:firstLine="0"/>
+        <w:ind w:left="720" w:firstLine="0"/>
       </w:pPr>
       <w:rPr/>
     </w:lvl>
@@ -2926,7 +2863,7 @@
       <w:lvlText w:val=""/>
       <w:lvlJc w:val="left"/>
       <w:pPr>
-        <w:ind w:left="0" w:firstLine="0"/>
+        <w:ind w:left="720" w:firstLine="0"/>
       </w:pPr>
       <w:rPr/>
     </w:lvl>
@@ -2936,7 +2873,7 @@
       <w:lvlText w:val=""/>
       <w:lvlJc w:val="left"/>
       <w:pPr>
-        <w:ind w:left="0" w:firstLine="0"/>
+        <w:ind w:left="720" w:firstLine="0"/>
       </w:pPr>
       <w:rPr/>
     </w:lvl>
@@ -2946,7 +2883,7 @@
       <w:lvlText w:val=""/>
       <w:lvlJc w:val="left"/>
       <w:pPr>
-        <w:ind w:left="0" w:firstLine="0"/>
+        <w:ind w:left="720" w:firstLine="0"/>
       </w:pPr>
       <w:rPr/>
     </w:lvl>
@@ -2956,7 +2893,7 @@
       <w:lvlText w:val=""/>
       <w:lvlJc w:val="left"/>
       <w:pPr>
-        <w:ind w:left="0" w:firstLine="0"/>
+        <w:ind w:left="720" w:firstLine="0"/>
       </w:pPr>
       <w:rPr/>
     </w:lvl>
@@ -2966,7 +2903,7 @@
       <w:lvlText w:val=""/>
       <w:lvlJc w:val="left"/>
       <w:pPr>
-        <w:ind w:left="0" w:firstLine="0"/>
+        <w:ind w:left="720" w:firstLine="0"/>
       </w:pPr>
       <w:rPr/>
     </w:lvl>

</xml_diff>